<commit_message>
Measure what real kit dispensas leave; write the result into Sol's manual
31 real per-item dispensas: checked SP goods prices, measured freight to
each town (37/39 quotes reproduced), 4% Simples, R$473 fixed month.
Middle deal nets about R$100; 15 of 31 lose money; 14 clear the pass mark
(net >= R$800) with a median R$4.192, best four R$14.600-22.300. Those
need a median R$18.950 of cash; 5 fit the recorded R$12.894 budget.
Verdict: a selection business, not a volume one. data/typical_kit/RESULT.md.

Co-Authored-By: Claude Opus 5.5 <noreply@anthropic.com>
Claude-Session: https://claude.ai/code/session_01PWXeszJsBP7MjdCgG3Dabz
</commit_message>
<xml_diff>
--- a/docs/ACOLHE_Manual_Sol.docx
+++ b/docs/ACOLHE_Manual_Sol.docx
@@ -124,7 +124,7 @@
           <w:sz w:val="20"/>
           <w:szCs w:val="20"/>
         </w:rPr>
-        <w:t xml:space="preserve">Kits de enxoval para prefeituras, vendidos só por você. Ainda não se sabe se dão lucro.</w:t>
+        <w:t xml:space="preserve">Kits de enxoval para prefeituras, vendidos só por você. Metade das compras não dá lucro; a outra parte pode dar bem.</w:t>
       </w:r>
     </w:p>
     <w:tbl>
@@ -860,7 +860,7 @@
                 <w:sz w:val="17"/>
                 <w:szCs w:val="17"/>
               </w:rPr>
-              <w:t xml:space="preserve">O NÚMERO QUE DECIDE TUDO</w:t>
+              <w:t xml:space="preserve">O NÚMERO QUE DECIDE TUDO — MEDIDO</w:t>
             </w:r>
           </w:p>
           <w:p>
@@ -875,7 +875,7 @@
                 <w:sz w:val="20"/>
                 <w:szCs w:val="20"/>
               </w:rPr>
-              <w:t xml:space="preserve">Quanto custa um kit comum de dispensa.</w:t>
+              <w:t xml:space="preserve">Medido em 31 compras reais por dispensa:</w:t>
             </w:r>
             <w:r>
               <w:rPr>
@@ -883,13 +883,23 @@
                 <w:sz w:val="20"/>
                 <w:szCs w:val="20"/>
               </w:rPr>
-              <w:t xml:space="preserve"> Em medição: 42 compras reais (587 itens), cada item com preço de SP, link e dupla conferência.</w:t>
+              <w:t xml:space="preserve"> cada item com preço de SP conferido, frete medido até a cidade, Simples de 4% e custo fixo do mês.</w:t>
             </w:r>
           </w:p>
           <w:p>
             <w:pPr>
-              <w:spacing w:after="50" w:line="252"/>
+              <w:spacing w:after="50"/>
+              <w:ind w:left="300" w:hanging="220"/>
             </w:pPr>
+            <w:r>
+              <w:rPr>
+                <w:rFonts w:ascii="Calibri" w:cs="Calibri" w:eastAsia="Calibri" w:hAnsi="Calibri"/>
+                <w:color w:val="2E7D6B"/>
+                <w:sz w:val="20"/>
+                <w:szCs w:val="20"/>
+              </w:rPr>
+              <w:t xml:space="preserve">•	</w:t>
+            </w:r>
             <w:r>
               <w:rPr>
                 <w:rFonts w:ascii="Calibri" w:cs="Calibri" w:eastAsia="Calibri" w:hAnsi="Calibri"/>
@@ -898,7 +908,7 @@
                 <w:sz w:val="20"/>
                 <w:szCs w:val="20"/>
               </w:rPr>
-              <w:t xml:space="preserve">Por que decide:</w:t>
+              <w:t xml:space="preserve">Metade não paga:</w:t>
             </w:r>
             <w:r>
               <w:rPr>
@@ -906,7 +916,22 @@
                 <w:sz w:val="20"/>
                 <w:szCs w:val="20"/>
               </w:rPr>
-              <w:t xml:space="preserve"> o preço de cada compra já se sabe; o custo, não. </w:t>
+              <w:t xml:space="preserve"> a compra do meio sobra uns R$ 100; 15 de 31 dão prejuízo.</w:t>
+            </w:r>
+          </w:p>
+          <w:p>
+            <w:pPr>
+              <w:spacing w:after="50"/>
+              <w:ind w:left="300" w:hanging="220"/>
+            </w:pPr>
+            <w:r>
+              <w:rPr>
+                <w:rFonts w:ascii="Calibri" w:cs="Calibri" w:eastAsia="Calibri" w:hAnsi="Calibri"/>
+                <w:color w:val="2E7D6B"/>
+                <w:sz w:val="20"/>
+                <w:szCs w:val="20"/>
+              </w:rPr>
+              <w:t xml:space="preserve">•	</w:t>
             </w:r>
             <w:r>
               <w:rPr>
@@ -916,7 +941,7 @@
                 <w:sz w:val="20"/>
                 <w:szCs w:val="20"/>
               </w:rPr>
-              <w:t xml:space="preserve">Quem mede:</w:t>
+              <w:t xml:space="preserve">14 de 31 passam na nota de corte</w:t>
             </w:r>
             <w:r>
               <w:rPr>
@@ -924,7 +949,7 @@
                 <w:sz w:val="20"/>
                 <w:szCs w:val="20"/>
               </w:rPr>
-              <w:t xml:space="preserve"> quem preparou este manual, não você. </w:t>
+              <w:t xml:space="preserve"> (sobra ≥ R$ 800): mediana de </w:t>
             </w:r>
             <w:r>
               <w:rPr>
@@ -934,7 +959,7 @@
                 <w:sz w:val="20"/>
                 <w:szCs w:val="20"/>
               </w:rPr>
-              <w:t xml:space="preserve">O resultado será escrito nesta caixa</w:t>
+              <w:t xml:space="preserve">R$ 4.192</w:t>
             </w:r>
             <w:r>
               <w:rPr>
@@ -942,13 +967,23 @@
                 <w:sz w:val="20"/>
                 <w:szCs w:val="20"/>
               </w:rPr>
-              <w:t xml:space="preserve"> quando sair.</w:t>
+              <w:t xml:space="preserve"> por pedido; as 4 melhores, R$ 14.600 a R$ 22.300.</w:t>
             </w:r>
           </w:p>
           <w:p>
             <w:pPr>
-              <w:spacing w:after="50" w:line="252"/>
+              <w:spacing w:after="50"/>
+              <w:ind w:left="300" w:hanging="220"/>
             </w:pPr>
+            <w:r>
+              <w:rPr>
+                <w:rFonts w:ascii="Calibri" w:cs="Calibri" w:eastAsia="Calibri" w:hAnsi="Calibri"/>
+                <w:color w:val="2E7D6B"/>
+                <w:sz w:val="20"/>
+                <w:szCs w:val="20"/>
+              </w:rPr>
+              <w:t xml:space="preserve">•	</w:t>
+            </w:r>
             <w:r>
               <w:rPr>
                 <w:rFonts w:ascii="Calibri" w:cs="Calibri" w:eastAsia="Calibri" w:hAnsi="Calibri"/>
@@ -957,7 +992,7 @@
                 <w:sz w:val="20"/>
                 <w:szCs w:val="20"/>
               </w:rPr>
-              <w:t xml:space="preserve">SIGA exige:</w:t>
+              <w:t xml:space="preserve">O dinheiro decide:</w:t>
             </w:r>
             <w:r>
               <w:rPr>
@@ -965,7 +1000,7 @@
                 <w:sz w:val="20"/>
                 <w:szCs w:val="20"/>
               </w:rPr>
-              <w:t xml:space="preserve"> sobra que pague suas horas e custos fixos, </w:t>
+              <w:t xml:space="preserve"> um pedido que passa pede uns </w:t>
             </w:r>
             <w:r>
               <w:rPr>
@@ -975,7 +1010,7 @@
                 <w:sz w:val="20"/>
                 <w:szCs w:val="20"/>
               </w:rPr>
-              <w:t xml:space="preserve">e</w:t>
+              <w:t xml:space="preserve">R$ 19 mil</w:t>
             </w:r>
             <w:r>
               <w:rPr>
@@ -983,8 +1018,13 @@
                 <w:sz w:val="20"/>
                 <w:szCs w:val="20"/>
               </w:rPr>
-              <w:t xml:space="preserve"> lote que caiba no dinheiro. </w:t>
-            </w:r>
+              <w:t xml:space="preserve"> de caixa (mediana); só 5 dos 14 cabem em R$ 12.894.</w:t>
+            </w:r>
+          </w:p>
+          <w:p>
+            <w:pPr>
+              <w:spacing w:after="50" w:line="252"/>
+            </w:pPr>
             <w:r>
               <w:rPr>
                 <w:rFonts w:ascii="Calibri" w:cs="Calibri" w:eastAsia="Calibri" w:hAnsi="Calibri"/>
@@ -993,7 +1033,7 @@
                 <w:sz w:val="20"/>
                 <w:szCs w:val="20"/>
               </w:rPr>
-              <w:t xml:space="preserve">Se der PARE:</w:t>
+              <w:t xml:space="preserve">Resposta: SIGA só com seleção rígida, pedido a pedido, e com capital ou prazo de fornecedor para os pedidos grandes.</w:t>
             </w:r>
             <w:r>
               <w:rPr>
@@ -1001,109 +1041,7 @@
                 <w:sz w:val="20"/>
                 <w:szCs w:val="20"/>
               </w:rPr>
-              <w:t xml:space="preserve"> não abra a empresa; quem preparou este manual mede as medalhas (o plano B) do mesmo jeito.</w:t>
-            </w:r>
-          </w:p>
-          <w:p>
-            <w:pPr>
-              <w:spacing w:after="50"/>
-              <w:ind w:left="300" w:hanging="220"/>
-            </w:pPr>
-            <w:r>
-              <w:rPr>
-                <w:rFonts w:ascii="Calibri" w:cs="Calibri" w:eastAsia="Calibri" w:hAnsi="Calibri"/>
-                <w:color w:val="2E7D6B"/>
-                <w:sz w:val="20"/>
-                <w:szCs w:val="20"/>
-              </w:rPr>
-              <w:t xml:space="preserve">•	</w:t>
-            </w:r>
-            <w:r>
-              <w:rPr>
-                <w:rFonts w:ascii="Calibri" w:cs="Calibri" w:eastAsia="Calibri" w:hAnsi="Calibri"/>
-                <w:sz w:val="20"/>
-                <w:szCs w:val="20"/>
-              </w:rPr>
-              <w:t xml:space="preserve">Custo típico por kit: </w:t>
-            </w:r>
-            <w:r>
-              <w:rPr>
-                <w:rFonts w:ascii="Calibri" w:cs="Calibri" w:eastAsia="Calibri" w:hAnsi="Calibri"/>
-                <w:i/>
-                <w:iCs/>
-                <w:sz w:val="20"/>
-                <w:szCs w:val="20"/>
-              </w:rPr>
-              <w:t xml:space="preserve">a preencher</w:t>
-            </w:r>
-            <w:r>
-              <w:rPr>
-                <w:rFonts w:ascii="Calibri" w:cs="Calibri" w:eastAsia="Calibri" w:hAnsi="Calibri"/>
-                <w:sz w:val="20"/>
-                <w:szCs w:val="20"/>
-              </w:rPr>
-              <w:t xml:space="preserve"> · Kits que passam: </w:t>
-            </w:r>
-            <w:r>
-              <w:rPr>
-                <w:rFonts w:ascii="Calibri" w:cs="Calibri" w:eastAsia="Calibri" w:hAnsi="Calibri"/>
-                <w:i/>
-                <w:iCs/>
-                <w:sz w:val="20"/>
-                <w:szCs w:val="20"/>
-              </w:rPr>
-              <w:t xml:space="preserve">a preencher</w:t>
-            </w:r>
-          </w:p>
-          <w:p>
-            <w:pPr>
-              <w:spacing w:after="50"/>
-              <w:ind w:left="300" w:hanging="220"/>
-            </w:pPr>
-            <w:r>
-              <w:rPr>
-                <w:rFonts w:ascii="Calibri" w:cs="Calibri" w:eastAsia="Calibri" w:hAnsi="Calibri"/>
-                <w:color w:val="2E7D6B"/>
-                <w:sz w:val="20"/>
-                <w:szCs w:val="20"/>
-              </w:rPr>
-              <w:t xml:space="preserve">•	</w:t>
-            </w:r>
-            <w:r>
-              <w:rPr>
-                <w:rFonts w:ascii="Calibri" w:cs="Calibri" w:eastAsia="Calibri" w:hAnsi="Calibri"/>
-                <w:sz w:val="20"/>
-                <w:szCs w:val="20"/>
-              </w:rPr>
-              <w:t xml:space="preserve">Lote cabe no dinheiro? </w:t>
-            </w:r>
-            <w:r>
-              <w:rPr>
-                <w:rFonts w:ascii="Calibri" w:cs="Calibri" w:eastAsia="Calibri" w:hAnsi="Calibri"/>
-                <w:i/>
-                <w:iCs/>
-                <w:sz w:val="20"/>
-                <w:szCs w:val="20"/>
-              </w:rPr>
-              <w:t xml:space="preserve">a preencher</w:t>
-            </w:r>
-            <w:r>
-              <w:rPr>
-                <w:rFonts w:ascii="Calibri" w:cs="Calibri" w:eastAsia="Calibri" w:hAnsi="Calibri"/>
-                <w:sz w:val="20"/>
-                <w:szCs w:val="20"/>
-              </w:rPr>
-              <w:t xml:space="preserve"> · SIGA ou PARE: </w:t>
-            </w:r>
-            <w:r>
-              <w:rPr>
-                <w:rFonts w:ascii="Calibri" w:cs="Calibri" w:eastAsia="Calibri" w:hAnsi="Calibri"/>
-                <w:i/>
-                <w:iCs/>
-                <w:sz w:val="20"/>
-                <w:szCs w:val="20"/>
-              </w:rPr>
-              <w:t xml:space="preserve">a preencher</w:t>
+              <w:t xml:space="preserve"> Preços de catálogo, sem desconto de atacado; montagem não incluída.</w:t>
             </w:r>
           </w:p>
         </w:tc>
@@ -1234,7 +1172,7 @@
                 <w:sz w:val="20"/>
                 <w:szCs w:val="20"/>
               </w:rPr>
-              <w:t xml:space="preserve">, antes do resultado. Nota de corte: quanto um pedido deve deixar, pagos os custos, para suas horas.</w:t>
+              <w:t xml:space="preserve">, antes de olhar pedidos. Nota de corte: quanto um pedido deve deixar, pagos os custos, para suas horas.</w:t>
             </w:r>
           </w:p>
           <w:p>
@@ -1332,7 +1270,7 @@
                 <w:sz w:val="20"/>
                 <w:szCs w:val="20"/>
               </w:rPr>
-              <w:t xml:space="preserve">Quando a medição sair,</w:t>
+              <w:t xml:space="preserve">Decida o dinheiro:</w:t>
             </w:r>
             <w:r>
               <w:rPr>
@@ -1340,7 +1278,7 @@
                 <w:sz w:val="20"/>
                 <w:szCs w:val="20"/>
               </w:rPr>
-              <w:t xml:space="preserve"> aplique a nota de corte ao resultado.</w:t>
+              <w:t xml:space="preserve"> os bons pedidos pedem uns R$ 19 mil de caixa; com menos, só os pequenos.</w:t>
             </w:r>
           </w:p>
           <w:p>
@@ -1355,7 +1293,7 @@
                 <w:sz w:val="20"/>
                 <w:szCs w:val="20"/>
               </w:rPr>
-              <w:t xml:space="preserve">Até lá: não abra a empresa, não compre nada, não ligue para vender.</w:t>
+              <w:t xml:space="preserve">Até decidir o dinheiro: não abra a empresa, não compre nada, não ligue para vender.</w:t>
             </w:r>
           </w:p>
         </w:tc>
@@ -12822,7 +12760,7 @@
           <w:sz w:val="20"/>
           <w:szCs w:val="20"/>
         </w:rPr>
-        <w:t xml:space="preserve">O preço já tem uma primeira medida; o custo do kit comum, não. Até ele sair, não há margem para anunciar.</w:t>
+        <w:t xml:space="preserve">Medido em 31 compras reais: metade não paga, mas 1 em cada 2 ou 3 paga bem. O lucro está em escolher o pedido.</w:t>
       </w:r>
     </w:p>
     <w:p>
@@ -12872,10 +12810,10 @@
         </w:tblBorders>
       </w:tblPr>
       <w:tblGrid>
-        <w:gridCol w:w="2301"/>
-        <w:gridCol w:w="2100"/>
-        <w:gridCol w:w="2749"/>
-        <w:gridCol w:w="2750"/>
+        <w:gridCol w:w="2308"/>
+        <w:gridCol w:w="2076"/>
+        <w:gridCol w:w="2758"/>
+        <w:gridCol w:w="2758"/>
       </w:tblGrid>
       <w:tr>
         <w:trPr>
@@ -12884,7 +12822,7 @@
         </w:trPr>
         <w:tc>
           <w:tcPr>
-            <w:tcW w:type="dxa" w:w="2301"/>
+            <w:tcW w:type="dxa" w:w="2308"/>
             <w:tcBorders>
               <w:top w:val="single" w:color="BFBFBF" w:sz="4"/>
               <w:left w:val="single" w:color="BFBFBF" w:sz="4"/>
@@ -12916,7 +12854,7 @@
         </w:tc>
         <w:tc>
           <w:tcPr>
-            <w:tcW w:type="dxa" w:w="2100"/>
+            <w:tcW w:type="dxa" w:w="2076"/>
             <w:tcBorders>
               <w:top w:val="single" w:color="BFBFBF" w:sz="4"/>
               <w:left w:val="single" w:color="BFBFBF" w:sz="4"/>
@@ -12948,7 +12886,7 @@
         </w:tc>
         <w:tc>
           <w:tcPr>
-            <w:tcW w:type="dxa" w:w="2749"/>
+            <w:tcW w:type="dxa" w:w="2758"/>
             <w:tcBorders>
               <w:top w:val="single" w:color="BFBFBF" w:sz="4"/>
               <w:left w:val="single" w:color="BFBFBF" w:sz="4"/>
@@ -12980,7 +12918,7 @@
         </w:tc>
         <w:tc>
           <w:tcPr>
-            <w:tcW w:type="dxa" w:w="2750"/>
+            <w:tcW w:type="dxa" w:w="2758"/>
             <w:tcBorders>
               <w:top w:val="single" w:color="BFBFBF" w:sz="4"/>
               <w:left w:val="single" w:color="BFBFBF" w:sz="4"/>
@@ -13018,7 +12956,7 @@
         </w:trPr>
         <w:tc>
           <w:tcPr>
-            <w:tcW w:type="dxa" w:w="2301"/>
+            <w:tcW w:type="dxa" w:w="2308"/>
             <w:tcBorders>
               <w:top w:val="single" w:color="BFBFBF" w:sz="4"/>
               <w:left w:val="single" w:color="BFBFBF" w:sz="4"/>
@@ -13047,7 +12985,7 @@
         </w:tc>
         <w:tc>
           <w:tcPr>
-            <w:tcW w:type="dxa" w:w="2100"/>
+            <w:tcW w:type="dxa" w:w="2076"/>
             <w:tcBorders>
               <w:top w:val="single" w:color="BFBFBF" w:sz="4"/>
               <w:left w:val="single" w:color="BFBFBF" w:sz="4"/>
@@ -13076,7 +13014,7 @@
         </w:tc>
         <w:tc>
           <w:tcPr>
-            <w:tcW w:type="dxa" w:w="2749"/>
+            <w:tcW w:type="dxa" w:w="2758"/>
             <w:tcBorders>
               <w:top w:val="single" w:color="BFBFBF" w:sz="4"/>
               <w:left w:val="single" w:color="BFBFBF" w:sz="4"/>
@@ -13105,7 +13043,7 @@
         </w:tc>
         <w:tc>
           <w:tcPr>
-            <w:tcW w:type="dxa" w:w="2750"/>
+            <w:tcW w:type="dxa" w:w="2758"/>
             <w:tcBorders>
               <w:top w:val="single" w:color="BFBFBF" w:sz="4"/>
               <w:left w:val="single" w:color="BFBFBF" w:sz="4"/>
@@ -13151,7 +13089,7 @@
         </w:trPr>
         <w:tc>
           <w:tcPr>
-            <w:tcW w:type="dxa" w:w="2301"/>
+            <w:tcW w:type="dxa" w:w="2308"/>
             <w:tcBorders>
               <w:top w:val="single" w:color="BFBFBF" w:sz="4"/>
               <w:left w:val="single" w:color="BFBFBF" w:sz="4"/>
@@ -13181,7 +13119,7 @@
         </w:tc>
         <w:tc>
           <w:tcPr>
-            <w:tcW w:type="dxa" w:w="2100"/>
+            <w:tcW w:type="dxa" w:w="2076"/>
             <w:tcBorders>
               <w:top w:val="single" w:color="BFBFBF" w:sz="4"/>
               <w:left w:val="single" w:color="BFBFBF" w:sz="4"/>
@@ -13211,7 +13149,7 @@
         </w:tc>
         <w:tc>
           <w:tcPr>
-            <w:tcW w:type="dxa" w:w="2749"/>
+            <w:tcW w:type="dxa" w:w="2758"/>
             <w:tcBorders>
               <w:top w:val="single" w:color="BFBFBF" w:sz="4"/>
               <w:left w:val="single" w:color="BFBFBF" w:sz="4"/>
@@ -13241,7 +13179,7 @@
         </w:tc>
         <w:tc>
           <w:tcPr>
-            <w:tcW w:type="dxa" w:w="2750"/>
+            <w:tcW w:type="dxa" w:w="2758"/>
             <w:tcBorders>
               <w:top w:val="single" w:color="BFBFBF" w:sz="4"/>
               <w:left w:val="single" w:color="BFBFBF" w:sz="4"/>
@@ -13277,119 +13215,117 @@
         </w:trPr>
         <w:tc>
           <w:tcPr>
-            <w:tcW w:type="dxa" w:w="2301"/>
-            <w:tcBorders>
-              <w:top w:val="single" w:color="BFBFBF" w:sz="4"/>
-              <w:left w:val="single" w:color="BFBFBF" w:sz="4"/>
-              <w:bottom w:val="single" w:color="BFBFBF" w:sz="4"/>
-              <w:right w:val="single" w:color="BFBFBF" w:sz="4"/>
-            </w:tcBorders>
-            <w:tcMar>
-              <w:top w:type="dxa" w:w="35"/>
-              <w:left w:type="dxa" w:w="80"/>
-              <w:bottom w:type="dxa" w:w="35"/>
-              <w:right w:type="dxa" w:w="80"/>
-            </w:tcMar>
-            <w:vAlign w:val="center"/>
-          </w:tcPr>
-          <w:p>
-            <w:r>
-              <w:rPr>
-                <w:rFonts w:ascii="Calibri" w:cs="Calibri" w:eastAsia="Calibri" w:hAnsi="Calibri"/>
-                <w:color w:val="000000"/>
-                <w:sz w:val="18"/>
-                <w:szCs w:val="18"/>
-              </w:rPr>
-              <w:t xml:space="preserve">(c) Kit comum de aviso</w:t>
-            </w:r>
-          </w:p>
-        </w:tc>
-        <w:tc>
-          <w:tcPr>
-            <w:tcW w:type="dxa" w:w="2100"/>
-            <w:tcBorders>
-              <w:top w:val="single" w:color="BFBFBF" w:sz="4"/>
-              <w:left w:val="single" w:color="BFBFBF" w:sz="4"/>
-              <w:bottom w:val="single" w:color="BFBFBF" w:sz="4"/>
-              <w:right w:val="single" w:color="BFBFBF" w:sz="4"/>
-            </w:tcBorders>
-            <w:tcMar>
-              <w:top w:type="dxa" w:w="35"/>
-              <w:left w:type="dxa" w:w="80"/>
-              <w:bottom w:type="dxa" w:w="35"/>
-              <w:right w:type="dxa" w:w="80"/>
-            </w:tcMar>
-            <w:vAlign w:val="center"/>
-          </w:tcPr>
-          <w:p>
-            <w:r>
-              <w:rPr>
-                <w:rFonts w:ascii="Calibri" w:cs="Calibri" w:eastAsia="Calibri" w:hAnsi="Calibri"/>
-                <w:color w:val="000000"/>
-                <w:sz w:val="18"/>
-                <w:szCs w:val="18"/>
-              </w:rPr>
-              <w:t xml:space="preserve">Mediana R$ 236,72 (kits diferentes)</w:t>
-            </w:r>
-          </w:p>
-        </w:tc>
-        <w:tc>
-          <w:tcPr>
-            <w:tcW w:type="dxa" w:w="2749"/>
-            <w:tcBorders>
-              <w:top w:val="single" w:color="BFBFBF" w:sz="4"/>
-              <w:left w:val="single" w:color="BFBFBF" w:sz="4"/>
-              <w:bottom w:val="single" w:color="BFBFBF" w:sz="4"/>
-              <w:right w:val="single" w:color="BFBFBF" w:sz="4"/>
-            </w:tcBorders>
-            <w:tcMar>
-              <w:top w:type="dxa" w:w="35"/>
-              <w:left w:type="dxa" w:w="80"/>
-              <w:bottom w:type="dxa" w:w="35"/>
-              <w:right w:type="dxa" w:w="80"/>
-            </w:tcMar>
-            <w:vAlign w:val="center"/>
-          </w:tcPr>
-          <w:p>
-            <w:r>
-              <w:rPr>
-                <w:rFonts w:ascii="Calibri" w:cs="Calibri" w:eastAsia="Calibri" w:hAnsi="Calibri"/>
-                <w:b/>
-                <w:bCs/>
-                <w:color w:val="000000"/>
-                <w:sz w:val="18"/>
-                <w:szCs w:val="18"/>
-              </w:rPr>
-              <w:t xml:space="preserve">Sendo medido</w:t>
-            </w:r>
-          </w:p>
-        </w:tc>
-        <w:tc>
-          <w:tcPr>
-            <w:tcW w:type="dxa" w:w="2750"/>
-            <w:tcBorders>
-              <w:top w:val="single" w:color="BFBFBF" w:sz="4"/>
-              <w:left w:val="single" w:color="BFBFBF" w:sz="4"/>
-              <w:bottom w:val="single" w:color="BFBFBF" w:sz="4"/>
-              <w:right w:val="single" w:color="BFBFBF" w:sz="4"/>
-            </w:tcBorders>
-            <w:tcMar>
-              <w:top w:type="dxa" w:w="35"/>
-              <w:left w:type="dxa" w:w="80"/>
-              <w:bottom w:type="dxa" w:w="35"/>
-              <w:right w:type="dxa" w:w="80"/>
-            </w:tcMar>
-            <w:vAlign w:val="center"/>
-          </w:tcPr>
-          <w:p>
-            <w:r>
-              <w:rPr>
-                <w:rFonts w:ascii="Calibri" w:cs="Calibri" w:eastAsia="Calibri" w:hAnsi="Calibri"/>
-                <w:color w:val="000000"/>
-                <w:sz w:val="18"/>
-                <w:szCs w:val="18"/>
-              </w:rPr>
-              <w:t xml:space="preserve">Margem: ainda não dá para dizer</w:t>
+            <w:tcW w:type="dxa" w:w="2308"/>
+            <w:tcBorders>
+              <w:top w:val="single" w:color="BFBFBF" w:sz="4"/>
+              <w:left w:val="single" w:color="BFBFBF" w:sz="4"/>
+              <w:bottom w:val="single" w:color="BFBFBF" w:sz="4"/>
+              <w:right w:val="single" w:color="BFBFBF" w:sz="4"/>
+            </w:tcBorders>
+            <w:tcMar>
+              <w:top w:type="dxa" w:w="35"/>
+              <w:left w:type="dxa" w:w="80"/>
+              <w:bottom w:type="dxa" w:w="35"/>
+              <w:right w:type="dxa" w:w="80"/>
+            </w:tcMar>
+            <w:vAlign w:val="center"/>
+          </w:tcPr>
+          <w:p>
+            <w:r>
+              <w:rPr>
+                <w:rFonts w:ascii="Calibri" w:cs="Calibri" w:eastAsia="Calibri" w:hAnsi="Calibri"/>
+                <w:color w:val="000000"/>
+                <w:sz w:val="18"/>
+                <w:szCs w:val="18"/>
+              </w:rPr>
+              <w:t xml:space="preserve">(c) 31 compras reais por dispensa</w:t>
+            </w:r>
+          </w:p>
+        </w:tc>
+        <w:tc>
+          <w:tcPr>
+            <w:tcW w:type="dxa" w:w="2076"/>
+            <w:tcBorders>
+              <w:top w:val="single" w:color="BFBFBF" w:sz="4"/>
+              <w:left w:val="single" w:color="BFBFBF" w:sz="4"/>
+              <w:bottom w:val="single" w:color="BFBFBF" w:sz="4"/>
+              <w:right w:val="single" w:color="BFBFBF" w:sz="4"/>
+            </w:tcBorders>
+            <w:tcMar>
+              <w:top w:type="dxa" w:w="35"/>
+              <w:left w:type="dxa" w:w="80"/>
+              <w:bottom w:type="dxa" w:w="35"/>
+              <w:right w:type="dxa" w:w="80"/>
+            </w:tcMar>
+            <w:vAlign w:val="center"/>
+          </w:tcPr>
+          <w:p>
+            <w:r>
+              <w:rPr>
+                <w:rFonts w:ascii="Calibri" w:cs="Calibri" w:eastAsia="Calibri" w:hAnsi="Calibri"/>
+                <w:color w:val="000000"/>
+                <w:sz w:val="18"/>
+                <w:szCs w:val="18"/>
+              </w:rPr>
+              <w:t xml:space="preserve">O que cada prefeitura pagou</w:t>
+            </w:r>
+          </w:p>
+        </w:tc>
+        <w:tc>
+          <w:tcPr>
+            <w:tcW w:type="dxa" w:w="2758"/>
+            <w:tcBorders>
+              <w:top w:val="single" w:color="BFBFBF" w:sz="4"/>
+              <w:left w:val="single" w:color="BFBFBF" w:sz="4"/>
+              <w:bottom w:val="single" w:color="BFBFBF" w:sz="4"/>
+              <w:right w:val="single" w:color="BFBFBF" w:sz="4"/>
+            </w:tcBorders>
+            <w:tcMar>
+              <w:top w:type="dxa" w:w="35"/>
+              <w:left w:type="dxa" w:w="80"/>
+              <w:bottom w:type="dxa" w:w="35"/>
+              <w:right w:type="dxa" w:w="80"/>
+            </w:tcMar>
+            <w:vAlign w:val="center"/>
+          </w:tcPr>
+          <w:p>
+            <w:r>
+              <w:rPr>
+                <w:rFonts w:ascii="Calibri" w:cs="Calibri" w:eastAsia="Calibri" w:hAnsi="Calibri"/>
+                <w:color w:val="000000"/>
+                <w:sz w:val="18"/>
+                <w:szCs w:val="18"/>
+              </w:rPr>
+              <w:t xml:space="preserve">Itens conferidos + frete até a cidade</w:t>
+            </w:r>
+          </w:p>
+        </w:tc>
+        <w:tc>
+          <w:tcPr>
+            <w:tcW w:type="dxa" w:w="2758"/>
+            <w:tcBorders>
+              <w:top w:val="single" w:color="BFBFBF" w:sz="4"/>
+              <w:left w:val="single" w:color="BFBFBF" w:sz="4"/>
+              <w:bottom w:val="single" w:color="BFBFBF" w:sz="4"/>
+              <w:right w:val="single" w:color="BFBFBF" w:sz="4"/>
+            </w:tcBorders>
+            <w:tcMar>
+              <w:top w:type="dxa" w:w="35"/>
+              <w:left w:type="dxa" w:w="80"/>
+              <w:bottom w:type="dxa" w:w="35"/>
+              <w:right w:type="dxa" w:w="80"/>
+            </w:tcMar>
+            <w:vAlign w:val="center"/>
+          </w:tcPr>
+          <w:p>
+            <w:r>
+              <w:rPr>
+                <w:rFonts w:ascii="Calibri" w:cs="Calibri" w:eastAsia="Calibri" w:hAnsi="Calibri"/>
+                <w:color w:val="000000"/>
+                <w:sz w:val="18"/>
+                <w:szCs w:val="18"/>
+              </w:rPr>
+              <w:t xml:space="preserve">Do meio: ~R$ 100; 14 passam (mediana R$ 4.192)</w:t>
             </w:r>
           </w:p>
         </w:tc>
@@ -15156,7 +15092,7 @@
                 <w:sz w:val="18"/>
                 <w:szCs w:val="18"/>
               </w:rPr>
-              <w:t xml:space="preserve">Kit comum caro demais</w:t>
+              <w:t xml:space="preserve">Pedido errado</w:t>
             </w:r>
           </w:p>
         </w:tc>
@@ -15185,7 +15121,7 @@
                 <w:sz w:val="18"/>
                 <w:szCs w:val="18"/>
               </w:rPr>
-              <w:t xml:space="preserve">É a margem inteira</w:t>
+              <w:t xml:space="preserve">Metade das compras reais dá prejuízo ou quase nada</w:t>
             </w:r>
           </w:p>
         </w:tc>
@@ -15214,7 +15150,7 @@
                 <w:sz w:val="18"/>
                 <w:szCs w:val="18"/>
               </w:rPr>
-              <w:t xml:space="preserve">Medição; nota de corte</w:t>
+              <w:t xml:space="preserve">Nota de corte, pedido a pedido</w:t>
             </w:r>
           </w:p>
         </w:tc>
@@ -16131,7 +16067,7 @@
                 <w:sz w:val="18"/>
                 <w:szCs w:val="18"/>
               </w:rPr>
-              <w:t xml:space="preserve">Custo do kit comum</w:t>
+              <w:t xml:space="preserve">Custo com preço de atacado</w:t>
             </w:r>
           </w:p>
         </w:tc>
@@ -16160,7 +16096,7 @@
                 <w:sz w:val="18"/>
                 <w:szCs w:val="18"/>
               </w:rPr>
-              <w:t xml:space="preserve">Medição em andamento</w:t>
+              <w:t xml:space="preserve">Pedir a tabela do Emilio</w:t>
             </w:r>
           </w:p>
         </w:tc>
@@ -17281,15 +17217,15 @@
           <w:sz w:val="20"/>
           <w:szCs w:val="20"/>
         </w:rPr>
-        <w:t xml:space="preserve">Quando a medição sair:</w:t>
-      </w:r>
-      <w:r>
-        <w:rPr>
-          <w:rFonts w:ascii="Calibri" w:cs="Calibri" w:eastAsia="Calibri" w:hAnsi="Calibri"/>
-          <w:sz w:val="20"/>
-          <w:szCs w:val="20"/>
-        </w:rPr>
-        <w:t xml:space="preserve"> escreva os números na Página 1 e aplique a nota de corte: SIGA ou PARE.</w:t>
+        <w:t xml:space="preserve">Decida o dinheiro</w:t>
+      </w:r>
+      <w:r>
+        <w:rPr>
+          <w:rFonts w:ascii="Calibri" w:cs="Calibri" w:eastAsia="Calibri" w:hAnsi="Calibri"/>
+          <w:sz w:val="20"/>
+          <w:szCs w:val="20"/>
+        </w:rPr>
+        <w:t xml:space="preserve"> (Página 1): quanto você tem ou consegue emprestado define quais pedidos cabem.</w:t>
       </w:r>
     </w:p>
     <w:p>

</xml_diff>